<commit_message>
updated documentation (todo list)
</commit_message>
<xml_diff>
--- a/documentation.docx
+++ b/documentation.docx
@@ -1,6 +1,6 @@
 
 <file path=word/document.xml><?xml version="1.0" encoding="utf-8"?>
-<w:document xmlns:wpc="http://schemas.microsoft.com/office/word/2010/wordprocessingCanvas" xmlns:cx="http://schemas.microsoft.com/office/drawing/2014/chartex" xmlns:cx1="http://schemas.microsoft.com/office/drawing/2015/9/8/chartex" xmlns:cx2="http://schemas.microsoft.com/office/drawing/2015/10/21/chartex" xmlns:cx3="http://schemas.microsoft.com/office/drawing/2016/5/9/chartex" xmlns:cx4="http://schemas.microsoft.com/office/drawing/2016/5/10/chartex" xmlns:cx5="http://schemas.microsoft.com/office/drawing/2016/5/11/chartex" xmlns:cx6="http://schemas.microsoft.com/office/drawing/2016/5/12/chartex" xmlns:cx7="http://schemas.microsoft.com/office/drawing/2016/5/13/chartex" xmlns:cx8="http://schemas.microsoft.com/office/drawing/2016/5/14/chartex" xmlns:mc="http://schemas.openxmlformats.org/markup-compatibility/2006" xmlns:aink="http://schemas.microsoft.com/office/drawing/2016/ink" xmlns:am3d="http://schemas.microsoft.com/office/drawing/2017/model3d" xmlns:o="urn:schemas-microsoft-com:office:office" xmlns:oel="http://schemas.microsoft.com/office/2019/extlst" xmlns:r="http://schemas.openxmlformats.org/officeDocument/2006/relationships" xmlns:m="http://schemas.openxmlformats.org/officeDocument/2006/math" xmlns:v="urn:schemas-microsoft-com:vml" xmlns:wp14="http://schemas.microsoft.com/office/word/2010/wordprocessingDrawing" xmlns:wp="http://schemas.openxmlformats.org/drawingml/2006/wordprocessingDrawing" xmlns:w10="urn:schemas-microsoft-com:office:word" xmlns:w="http://schemas.openxmlformats.org/wordprocessingml/2006/main" xmlns:w14="http://schemas.microsoft.com/office/word/2010/wordml" xmlns:w15="http://schemas.microsoft.com/office/word/2012/wordml" xmlns:w16cex="http://schemas.microsoft.com/office/word/2018/wordml/cex" xmlns:w16cid="http://schemas.microsoft.com/office/word/2016/wordml/cid" xmlns:w16="http://schemas.microsoft.com/office/word/2018/wordml" xmlns:w16du="http://schemas.microsoft.com/office/word/2023/wordml/word16du" xmlns:w16sdtdh="http://schemas.microsoft.com/office/word/2020/wordml/sdtdatahash" xmlns:w16se="http://schemas.microsoft.com/office/word/2015/wordml/symex" xmlns:wpg="http://schemas.microsoft.com/office/word/2010/wordprocessingGroup" xmlns:wpi="http://schemas.microsoft.com/office/word/2010/wordprocessingInk" xmlns:wne="http://schemas.microsoft.com/office/word/2006/wordml" xmlns:wps="http://schemas.microsoft.com/office/word/2010/wordprocessingShape" mc:Ignorable="w14 w15 w16se w16cid w16 w16cex w16sdtdh w16du wp14">
+<w:document xmlns:wpc="http://schemas.microsoft.com/office/word/2010/wordprocessingCanvas" xmlns:cx="http://schemas.microsoft.com/office/drawing/2014/chartex" xmlns:cx1="http://schemas.microsoft.com/office/drawing/2015/9/8/chartex" xmlns:cx2="http://schemas.microsoft.com/office/drawing/2015/10/21/chartex" xmlns:cx3="http://schemas.microsoft.com/office/drawing/2016/5/9/chartex" xmlns:cx4="http://schemas.microsoft.com/office/drawing/2016/5/10/chartex" xmlns:cx5="http://schemas.microsoft.com/office/drawing/2016/5/11/chartex" xmlns:cx6="http://schemas.microsoft.com/office/drawing/2016/5/12/chartex" xmlns:cx7="http://schemas.microsoft.com/office/drawing/2016/5/13/chartex" xmlns:cx8="http://schemas.microsoft.com/office/drawing/2016/5/14/chartex" xmlns:mc="http://schemas.openxmlformats.org/markup-compatibility/2006" xmlns:aink="http://schemas.microsoft.com/office/drawing/2016/ink" xmlns:am3d="http://schemas.microsoft.com/office/drawing/2017/model3d" xmlns:o="urn:schemas-microsoft-com:office:office" xmlns:oel="http://schemas.microsoft.com/office/2019/extlst" xmlns:r="http://schemas.openxmlformats.org/officeDocument/2006/relationships" xmlns:m="http://schemas.openxmlformats.org/officeDocument/2006/math" xmlns:v="urn:schemas-microsoft-com:vml" xmlns:wp14="http://schemas.microsoft.com/office/word/2010/wordprocessingDrawing" xmlns:wp="http://schemas.openxmlformats.org/drawingml/2006/wordprocessingDrawing" xmlns:w10="urn:schemas-microsoft-com:office:word" xmlns:w="http://schemas.openxmlformats.org/wordprocessingml/2006/main" xmlns:w14="http://schemas.microsoft.com/office/word/2010/wordml" xmlns:w15="http://schemas.microsoft.com/office/word/2012/wordml" xmlns:w16cex="http://schemas.microsoft.com/office/word/2018/wordml/cex" xmlns:w16cid="http://schemas.microsoft.com/office/word/2016/wordml/cid" xmlns:w16="http://schemas.microsoft.com/office/word/2018/wordml" xmlns:w16du="http://schemas.microsoft.com/office/word/2023/wordml/word16du" xmlns:w16sdtdh="http://schemas.microsoft.com/office/word/2020/wordml/sdtdatahash" xmlns:w16sdtfl="http://schemas.microsoft.com/office/word/2024/wordml/sdtformatlock" xmlns:w16se="http://schemas.microsoft.com/office/word/2015/wordml/symex" xmlns:wpg="http://schemas.microsoft.com/office/word/2010/wordprocessingGroup" xmlns:wpi="http://schemas.microsoft.com/office/word/2010/wordprocessingInk" xmlns:wne="http://schemas.microsoft.com/office/word/2006/wordml" xmlns:wps="http://schemas.microsoft.com/office/word/2010/wordprocessingShape" mc:Ignorable="w14 w15 w16se w16cid w16 w16cex w16sdtdh w16sdtfl w16du wp14">
   <w:body>
     <w:p>
       <w:pPr>
@@ -139,6 +139,23 @@
       <w:pPr>
         <w:pStyle w:val="ListParagraph"/>
         <w:numPr>
+          <w:ilvl w:val="1"/>
+          <w:numId w:val="1"/>
+        </w:numPr>
+      </w:pPr>
+      <w:r>
+        <w:t xml:space="preserve">Or external </w:t>
+      </w:r>
+      <w:proofErr w:type="spellStart"/>
+      <w:r>
+        <w:t>paypal</w:t>
+      </w:r>
+      <w:proofErr w:type="spellEnd"/>
+    </w:p>
+    <w:p>
+      <w:pPr>
+        <w:pStyle w:val="ListParagraph"/>
+        <w:numPr>
           <w:ilvl w:val="0"/>
           <w:numId w:val="1"/>
         </w:numPr>
@@ -156,7 +173,93 @@
         </w:numPr>
       </w:pPr>
       <w:r>
-        <w:t>TBD: maybe google calendar implementation</w:t>
+        <w:t>Events that alumni would be interested in</w:t>
+      </w:r>
+    </w:p>
+    <w:p>
+      <w:pPr>
+        <w:pStyle w:val="ListParagraph"/>
+        <w:numPr>
+          <w:ilvl w:val="2"/>
+          <w:numId w:val="1"/>
+        </w:numPr>
+      </w:pPr>
+      <w:r>
+        <w:t>Derby Days</w:t>
+      </w:r>
+    </w:p>
+    <w:p>
+      <w:pPr>
+        <w:pStyle w:val="ListParagraph"/>
+        <w:numPr>
+          <w:ilvl w:val="3"/>
+          <w:numId w:val="1"/>
+        </w:numPr>
+      </w:pPr>
+      <w:r>
+        <w:t>Black and White</w:t>
+      </w:r>
+    </w:p>
+    <w:p>
+      <w:pPr>
+        <w:pStyle w:val="ListParagraph"/>
+        <w:numPr>
+          <w:ilvl w:val="2"/>
+          <w:numId w:val="1"/>
+        </w:numPr>
+      </w:pPr>
+      <w:r>
+        <w:t>Sweetheart</w:t>
+      </w:r>
+    </w:p>
+    <w:p>
+      <w:pPr>
+        <w:pStyle w:val="ListParagraph"/>
+        <w:numPr>
+          <w:ilvl w:val="2"/>
+          <w:numId w:val="1"/>
+        </w:numPr>
+      </w:pPr>
+      <w:proofErr w:type="spellStart"/>
+      <w:r>
+        <w:t>Sigtoberfest</w:t>
+      </w:r>
+      <w:proofErr w:type="spellEnd"/>
+    </w:p>
+    <w:p>
+      <w:pPr>
+        <w:pStyle w:val="ListParagraph"/>
+        <w:numPr>
+          <w:ilvl w:val="0"/>
+          <w:numId w:val="1"/>
+        </w:numPr>
+      </w:pPr>
+      <w:r>
+        <w:t>Email sign up for alumni</w:t>
+      </w:r>
+    </w:p>
+    <w:p>
+      <w:pPr>
+        <w:pStyle w:val="ListParagraph"/>
+        <w:numPr>
+          <w:ilvl w:val="0"/>
+          <w:numId w:val="1"/>
+        </w:numPr>
+      </w:pPr>
+      <w:r>
+        <w:t>Member page – maybe just executive board</w:t>
+      </w:r>
+    </w:p>
+    <w:p>
+      <w:pPr>
+        <w:pStyle w:val="ListParagraph"/>
+        <w:numPr>
+          <w:ilvl w:val="0"/>
+          <w:numId w:val="1"/>
+        </w:numPr>
+      </w:pPr>
+      <w:r>
+        <w:t>Feed of Ig posts</w:t>
       </w:r>
     </w:p>
     <w:sectPr>
@@ -170,7 +273,7 @@
 </file>
 
 <file path=word/numbering.xml><?xml version="1.0" encoding="utf-8"?>
-<w:numbering xmlns:wpc="http://schemas.microsoft.com/office/word/2010/wordprocessingCanvas" xmlns:cx="http://schemas.microsoft.com/office/drawing/2014/chartex" xmlns:cx1="http://schemas.microsoft.com/office/drawing/2015/9/8/chartex" xmlns:cx2="http://schemas.microsoft.com/office/drawing/2015/10/21/chartex" xmlns:cx3="http://schemas.microsoft.com/office/drawing/2016/5/9/chartex" xmlns:cx4="http://schemas.microsoft.com/office/drawing/2016/5/10/chartex" xmlns:cx5="http://schemas.microsoft.com/office/drawing/2016/5/11/chartex" xmlns:cx6="http://schemas.microsoft.com/office/drawing/2016/5/12/chartex" xmlns:cx7="http://schemas.microsoft.com/office/drawing/2016/5/13/chartex" xmlns:cx8="http://schemas.microsoft.com/office/drawing/2016/5/14/chartex" xmlns:mc="http://schemas.openxmlformats.org/markup-compatibility/2006" xmlns:aink="http://schemas.microsoft.com/office/drawing/2016/ink" xmlns:am3d="http://schemas.microsoft.com/office/drawing/2017/model3d" xmlns:o="urn:schemas-microsoft-com:office:office" xmlns:oel="http://schemas.microsoft.com/office/2019/extlst" xmlns:r="http://schemas.openxmlformats.org/officeDocument/2006/relationships" xmlns:m="http://schemas.openxmlformats.org/officeDocument/2006/math" xmlns:v="urn:schemas-microsoft-com:vml" xmlns:wp14="http://schemas.microsoft.com/office/word/2010/wordprocessingDrawing" xmlns:wp="http://schemas.openxmlformats.org/drawingml/2006/wordprocessingDrawing" xmlns:w10="urn:schemas-microsoft-com:office:word" xmlns:w="http://schemas.openxmlformats.org/wordprocessingml/2006/main" xmlns:w14="http://schemas.microsoft.com/office/word/2010/wordml" xmlns:w15="http://schemas.microsoft.com/office/word/2012/wordml" xmlns:w16cex="http://schemas.microsoft.com/office/word/2018/wordml/cex" xmlns:w16cid="http://schemas.microsoft.com/office/word/2016/wordml/cid" xmlns:w16="http://schemas.microsoft.com/office/word/2018/wordml" xmlns:w16du="http://schemas.microsoft.com/office/word/2023/wordml/word16du" xmlns:w16sdtdh="http://schemas.microsoft.com/office/word/2020/wordml/sdtdatahash" xmlns:w16se="http://schemas.microsoft.com/office/word/2015/wordml/symex" xmlns:wpg="http://schemas.microsoft.com/office/word/2010/wordprocessingGroup" xmlns:wpi="http://schemas.microsoft.com/office/word/2010/wordprocessingInk" xmlns:wne="http://schemas.microsoft.com/office/word/2006/wordml" xmlns:wps="http://schemas.microsoft.com/office/word/2010/wordprocessingShape" mc:Ignorable="w14 w15 w16se w16cid w16 w16cex w16sdtdh w16du wp14">
+<w:numbering xmlns:wpc="http://schemas.microsoft.com/office/word/2010/wordprocessingCanvas" xmlns:cx="http://schemas.microsoft.com/office/drawing/2014/chartex" xmlns:cx1="http://schemas.microsoft.com/office/drawing/2015/9/8/chartex" xmlns:cx2="http://schemas.microsoft.com/office/drawing/2015/10/21/chartex" xmlns:cx3="http://schemas.microsoft.com/office/drawing/2016/5/9/chartex" xmlns:cx4="http://schemas.microsoft.com/office/drawing/2016/5/10/chartex" xmlns:cx5="http://schemas.microsoft.com/office/drawing/2016/5/11/chartex" xmlns:cx6="http://schemas.microsoft.com/office/drawing/2016/5/12/chartex" xmlns:cx7="http://schemas.microsoft.com/office/drawing/2016/5/13/chartex" xmlns:cx8="http://schemas.microsoft.com/office/drawing/2016/5/14/chartex" xmlns:mc="http://schemas.openxmlformats.org/markup-compatibility/2006" xmlns:aink="http://schemas.microsoft.com/office/drawing/2016/ink" xmlns:am3d="http://schemas.microsoft.com/office/drawing/2017/model3d" xmlns:o="urn:schemas-microsoft-com:office:office" xmlns:oel="http://schemas.microsoft.com/office/2019/extlst" xmlns:r="http://schemas.openxmlformats.org/officeDocument/2006/relationships" xmlns:m="http://schemas.openxmlformats.org/officeDocument/2006/math" xmlns:v="urn:schemas-microsoft-com:vml" xmlns:wp14="http://schemas.microsoft.com/office/word/2010/wordprocessingDrawing" xmlns:wp="http://schemas.openxmlformats.org/drawingml/2006/wordprocessingDrawing" xmlns:w10="urn:schemas-microsoft-com:office:word" xmlns:w="http://schemas.openxmlformats.org/wordprocessingml/2006/main" xmlns:w14="http://schemas.microsoft.com/office/word/2010/wordml" xmlns:w15="http://schemas.microsoft.com/office/word/2012/wordml" xmlns:w16cex="http://schemas.microsoft.com/office/word/2018/wordml/cex" xmlns:w16cid="http://schemas.microsoft.com/office/word/2016/wordml/cid" xmlns:w16="http://schemas.microsoft.com/office/word/2018/wordml" xmlns:w16du="http://schemas.microsoft.com/office/word/2023/wordml/word16du" xmlns:w16sdtdh="http://schemas.microsoft.com/office/word/2020/wordml/sdtdatahash" xmlns:w16sdtfl="http://schemas.microsoft.com/office/word/2024/wordml/sdtformatlock" xmlns:w16se="http://schemas.microsoft.com/office/word/2015/wordml/symex" xmlns:wpg="http://schemas.microsoft.com/office/word/2010/wordprocessingGroup" xmlns:wpi="http://schemas.microsoft.com/office/word/2010/wordprocessingInk" xmlns:wne="http://schemas.microsoft.com/office/word/2006/wordml" xmlns:wps="http://schemas.microsoft.com/office/word/2010/wordprocessingShape" mc:Ignorable="w14 w15 w16se w16cid w16 w16cex w16sdtdh w16sdtfl w16du wp14">
   <w:abstractNum w:abstractNumId="0" w15:restartNumberingAfterBreak="0">
     <w:nsid w:val="5B440215"/>
     <w:multiLevelType w:val="hybridMultilevel"/>
@@ -210,7 +313,7 @@
         <w:rFonts w:ascii="Wingdings" w:hAnsi="Wingdings" w:hint="default"/>
       </w:rPr>
     </w:lvl>
-    <w:lvl w:ilvl="3" w:tplc="04090001" w:tentative="1">
+    <w:lvl w:ilvl="3" w:tplc="04090001">
       <w:start w:val="1"/>
       <w:numFmt w:val="bullet"/>
       <w:lvlText w:val=""/>
@@ -290,7 +393,7 @@
 </file>
 
 <file path=word/styles.xml><?xml version="1.0" encoding="utf-8"?>
-<w:styles xmlns:mc="http://schemas.openxmlformats.org/markup-compatibility/2006" xmlns:r="http://schemas.openxmlformats.org/officeDocument/2006/relationships" xmlns:w="http://schemas.openxmlformats.org/wordprocessingml/2006/main" xmlns:w14="http://schemas.microsoft.com/office/word/2010/wordml" xmlns:w15="http://schemas.microsoft.com/office/word/2012/wordml" xmlns:w16cex="http://schemas.microsoft.com/office/word/2018/wordml/cex" xmlns:w16cid="http://schemas.microsoft.com/office/word/2016/wordml/cid" xmlns:w16="http://schemas.microsoft.com/office/word/2018/wordml" xmlns:w16du="http://schemas.microsoft.com/office/word/2023/wordml/word16du" xmlns:w16sdtdh="http://schemas.microsoft.com/office/word/2020/wordml/sdtdatahash" xmlns:w16se="http://schemas.microsoft.com/office/word/2015/wordml/symex" mc:Ignorable="w14 w15 w16se w16cid w16 w16cex w16sdtdh w16du">
+<w:styles xmlns:mc="http://schemas.openxmlformats.org/markup-compatibility/2006" xmlns:r="http://schemas.openxmlformats.org/officeDocument/2006/relationships" xmlns:w="http://schemas.openxmlformats.org/wordprocessingml/2006/main" xmlns:w14="http://schemas.microsoft.com/office/word/2010/wordml" xmlns:w15="http://schemas.microsoft.com/office/word/2012/wordml" xmlns:w16cex="http://schemas.microsoft.com/office/word/2018/wordml/cex" xmlns:w16cid="http://schemas.microsoft.com/office/word/2016/wordml/cid" xmlns:w16="http://schemas.microsoft.com/office/word/2018/wordml" xmlns:w16du="http://schemas.microsoft.com/office/word/2023/wordml/word16du" xmlns:w16sdtdh="http://schemas.microsoft.com/office/word/2020/wordml/sdtdatahash" xmlns:w16sdtfl="http://schemas.microsoft.com/office/word/2024/wordml/sdtformatlock" xmlns:w16se="http://schemas.microsoft.com/office/word/2015/wordml/symex" mc:Ignorable="w14 w15 w16se w16cid w16 w16cex w16sdtdh w16sdtfl w16du">
   <w:docDefaults>
     <w:rPrDefault>
       <w:rPr>
@@ -891,6 +994,7 @@
   <w:style w:type="character" w:default="1" w:styleId="DefaultParagraphFont">
     <w:name w:val="Default Paragraph Font"/>
     <w:uiPriority w:val="1"/>
+    <w:semiHidden/>
     <w:unhideWhenUsed/>
   </w:style>
   <w:style w:type="table" w:default="1" w:styleId="TableNormal">

</xml_diff>